<commit_message>
fix(invitation): 2-line letterhead, left-aligned contact line, real-size PDF font
- Letterhead address back to two lines (institution / street address), column
  starts at 6.5 cm and may run 1 cm into the right margin like the original
- "จัดส่งได้ที่ …" paragraph left-aligned: Thai-distributed alignment stretched
  it letter by letter in MS Word
- Bundled TH Sarabun New webfonts were enlarged ~1.41x by the webfont
  generator; rescale them (scripts/fix-sarabun-scale.py) so Gotenberg/
  LibreOffice breaks lines like MS Word
- Default coordinator: นายจิรเดช พิชัย, 096-8590-110, jiradech.pi@kmitl.ac.th;
  old drafts with empty coordinator fields pick up the new defaults

Co-Authored-By: Claude Opus 5.5 <noreply@anthropic.com>
Claude-Session: https://claude.ai/code/session_01JEgJAvTDToYMCAQDq7bf9F
</commit_message>
<xml_diff>
--- a/templates/invitation-letter.docx
+++ b/templates/invitation-letter.docx
@@ -50,7 +50,7 @@
     </w:p>
     <w:tbl>
       <w:tblPr>
-        <w:tblW w:type="dxa" w:w="9071"/>
+        <w:tblW w:type="dxa" w:w="9638"/>
         <w:tblBorders>
           <w:top w:val="none" w:color="auto" w:sz="0"/>
           <w:left w:val="none" w:color="auto" w:sz="0"/>
@@ -62,13 +62,13 @@
         <w:tblLayout w:type="fixed"/>
       </w:tblPr>
       <w:tblGrid>
-        <w:gridCol w:w="4535"/>
-        <w:gridCol w:w="4536"/>
+        <w:gridCol w:w="3685"/>
+        <w:gridCol w:w="5953"/>
       </w:tblGrid>
       <w:tr>
         <w:tc>
           <w:tcPr>
-            <w:tcW w:type="dxa" w:w="4535"/>
+            <w:tcW w:type="dxa" w:w="3685"/>
             <w:tcBorders>
               <w:top w:val="none" w:color="auto" w:sz="0"/>
               <w:left w:val="none" w:color="auto" w:sz="0"/>
@@ -99,7 +99,7 @@
         </w:tc>
         <w:tc>
           <w:tcPr>
-            <w:tcW w:type="dxa" w:w="4536"/>
+            <w:tcW w:type="dxa" w:w="5953"/>
             <w:tcBorders>
               <w:top w:val="none" w:color="auto" w:sz="0"/>
               <w:left w:val="none" w:color="auto" w:sz="0"/>
@@ -798,7 +798,7 @@
     <w:p>
       <w:pPr>
         <w:spacing w:after="0" w:before="240" w:line="380" w:lineRule="exact"/>
-        <w:jc w:val="thaiDistribute"/>
+        <w:jc w:val="left"/>
       </w:pPr>
       <w:r>
         <w:rPr>

</xml_diff>

<commit_message>
fix(invitation): match the original letter's ruler positions; flush PDF edges
- Use the faculty's real TH Sarabun New TTFs in Gotenberg (exact MS Word
  metrics); drop the rescaled webfonts and their script
- Emblem floats at the original position (3.33 cm, behind text) so the
  "ที่ …" line sits beside it; address at 8.73 cm with the original −2.08 cm
  right indent, date at 8.40 cm, 12 pt between blocks, 20.8 pt line pitch
- Signature block spacing as in the original (two blank lines around closing)
- PDF only: map Thai-distributed alignment to justify, which LibreOffice
  supports, so both edges are flush; the .docx keeps thaiDistribute

Co-Authored-By: Claude Opus 5.5 <noreply@anthropic.com>
Claude-Session: https://claude.ai/code/session_01JEgJAvTDToYMCAQDq7bf9F
</commit_message>
<xml_diff>
--- a/templates/invitation-letter.docx
+++ b/templates/invitation-letter.docx
@@ -4,14 +4,21 @@
   <w:body>
     <w:p>
       <w:pPr>
-        <w:spacing w:after="120" w:before="0" w:line="240" w:lineRule="auto"/>
-        <w:jc w:val="center"/>
+        <w:spacing w:after="0" w:before="0" w:line="416" w:lineRule="exact"/>
       </w:pPr>
       <w:r>
         <w:drawing>
-          <wp:inline distT="0" distB="0" distL="0" distR="0">
-            <wp:extent cx="1076325" cy="1076325"/>
+          <wp:anchor distT="0" distB="0" distL="0" distR="0" simplePos="0" allowOverlap="1" behindDoc="1" locked="1" layoutInCell="1" relativeHeight="1200150">
+            <wp:simplePos x="0" y="0"/>
+            <wp:positionH relativeFrom="column">
+              <wp:posOffset>2063750</wp:posOffset>
+            </wp:positionH>
+            <wp:positionV relativeFrom="page">
+              <wp:posOffset>558000</wp:posOffset>
+            </wp:positionV>
+            <wp:extent cx="1200150" cy="1200150"/>
             <wp:effectExtent t="0" r="0" b="0" l="0"/>
+            <wp:wrapNone/>
             <wp:docPr id="1" name="KMITL emblem" descr="ตราสัญลักษณ์สถาบันเทคโนโลยีพระจอมเกล้าเจ้าคุณทหารลาดกระบัง" title="ตราสัญลักษณ์ สจล."/>
             <wp:cNvGraphicFramePr>
               <a:graphicFrameLocks xmlns:a="http://schemas.openxmlformats.org/drawingml/2006/main" noChangeAspect="1"/>
@@ -35,7 +42,7 @@
                   <pic:spPr bwMode="auto">
                     <a:xfrm>
                       <a:off x="0" y="0"/>
-                      <a:ext cx="1076325" cy="1076325"/>
+                      <a:ext cx="1200150" cy="1200150"/>
                     </a:xfrm>
                     <a:prstGeom prst="rect">
                       <a:avLst/>
@@ -44,13 +51,27 @@
                 </pic:pic>
               </a:graphicData>
             </a:graphic>
-          </wp:inline>
+          </wp:anchor>
         </w:drawing>
+      </w:r>
+    </w:p>
+    <w:p>
+      <w:pPr>
+        <w:spacing w:after="240" w:before="240" w:line="416" w:lineRule="exact"/>
+      </w:pPr>
+      <w:r>
+        <w:rPr>
+          <w:rFonts w:ascii="TH SarabunPSK" w:cs="TH SarabunPSK" w:eastAsia="TH SarabunPSK" w:hAnsi="TH SarabunPSK"/>
+          <w:sz w:val="32"/>
+          <w:szCs w:val="32"/>
+          <w:lang w:val="en-US" w:bidi="th-TH"/>
+        </w:rPr>
+        <w:t xml:space="preserve"/>
       </w:r>
     </w:p>
     <w:tbl>
       <w:tblPr>
-        <w:tblW w:type="dxa" w:w="9638"/>
+        <w:tblW w:type="dxa" w:w="10251"/>
         <w:tblBorders>
           <w:top w:val="none" w:color="auto" w:sz="0"/>
           <w:left w:val="none" w:color="auto" w:sz="0"/>
@@ -62,13 +83,13 @@
         <w:tblLayout w:type="fixed"/>
       </w:tblPr>
       <w:tblGrid>
-        <w:gridCol w:w="3685"/>
-        <w:gridCol w:w="5953"/>
+        <w:gridCol w:w="4949"/>
+        <w:gridCol w:w="5302"/>
       </w:tblGrid>
       <w:tr>
         <w:tc>
           <w:tcPr>
-            <w:tcW w:type="dxa" w:w="3685"/>
+            <w:tcW w:type="dxa" w:w="4949"/>
             <w:tcBorders>
               <w:top w:val="none" w:color="auto" w:sz="0"/>
               <w:left w:val="none" w:color="auto" w:sz="0"/>
@@ -84,7 +105,7 @@
           </w:tcPr>
           <w:p>
             <w:pPr>
-              <w:spacing w:after="0" w:before="0" w:line="380" w:lineRule="exact"/>
+              <w:spacing w:after="0" w:before="0" w:line="416" w:lineRule="exact"/>
             </w:pPr>
             <w:r>
               <w:rPr>
@@ -99,7 +120,7 @@
         </w:tc>
         <w:tc>
           <w:tcPr>
-            <w:tcW w:type="dxa" w:w="5953"/>
+            <w:tcW w:type="dxa" w:w="5302"/>
             <w:tcBorders>
               <w:top w:val="none" w:color="auto" w:sz="0"/>
               <w:left w:val="none" w:color="auto" w:sz="0"/>
@@ -115,7 +136,7 @@
           </w:tcPr>
           <w:p>
             <w:pPr>
-              <w:spacing w:after="0" w:before="0" w:line="380" w:lineRule="exact"/>
+              <w:spacing w:after="0" w:before="0" w:line="416" w:lineRule="exact"/>
             </w:pPr>
             <w:r>
               <w:rPr>
@@ -129,7 +150,7 @@
           </w:p>
           <w:p>
             <w:pPr>
-              <w:spacing w:after="0" w:before="0" w:line="380" w:lineRule="exact"/>
+              <w:spacing w:after="0" w:before="0" w:line="416" w:lineRule="exact"/>
             </w:pPr>
             <w:r>
               <w:rPr>
@@ -143,7 +164,7 @@
           </w:p>
           <w:p>
             <w:pPr>
-              <w:spacing w:after="0" w:before="0" w:line="380" w:lineRule="exact"/>
+              <w:spacing w:after="0" w:before="0" w:line="416" w:lineRule="exact"/>
             </w:pPr>
             <w:r>
               <w:rPr>
@@ -160,8 +181,8 @@
     </w:tbl>
     <w:p>
       <w:pPr>
-        <w:spacing w:after="120" w:before="120" w:line="380" w:lineRule="exact"/>
-        <w:ind w:left="4535"/>
+        <w:spacing w:after="0" w:before="240" w:line="416" w:lineRule="exact"/>
+        <w:ind w:left="4762"/>
       </w:pPr>
       <w:r>
         <w:rPr>
@@ -175,7 +196,7 @@
     </w:p>
     <w:p>
       <w:pPr>
-        <w:spacing w:after="0" w:before="120" w:line="380" w:lineRule="exact"/>
+        <w:spacing w:after="0" w:before="240" w:line="416" w:lineRule="exact"/>
         <w:ind w:left="720" w:hanging="720"/>
         <w:jc w:val="thaiDistribute"/>
       </w:pPr>
@@ -209,7 +230,7 @@
     </w:p>
     <w:p>
       <w:pPr>
-        <w:spacing w:after="120" w:before="120" w:line="380" w:lineRule="exact"/>
+        <w:spacing w:after="0" w:before="240" w:line="416" w:lineRule="exact"/>
         <w:ind w:left="720" w:hanging="720"/>
         <w:jc w:val="thaiDistribute"/>
       </w:pPr>
@@ -243,7 +264,7 @@
     </w:p>
     <w:p>
       <w:pPr>
-        <w:spacing w:after="120" w:before="0" w:line="380" w:lineRule="exact"/>
+        <w:spacing w:after="0" w:before="240" w:line="416" w:lineRule="exact"/>
         <w:ind w:firstLine="1440"/>
         <w:jc w:val="thaiDistribute"/>
       </w:pPr>
@@ -279,7 +300,7 @@
     </w:p>
     <w:p>
       <w:pPr>
-        <w:spacing w:after="120" w:before="0" w:line="380" w:lineRule="exact"/>
+        <w:spacing w:after="0" w:before="240" w:line="416" w:lineRule="exact"/>
         <w:ind w:firstLine="1440"/>
         <w:jc w:val="thaiDistribute"/>
       </w:pPr>
@@ -295,7 +316,7 @@
     </w:p>
     <w:p>
       <w:pPr>
-        <w:spacing w:after="120" w:before="0" w:line="380" w:lineRule="exact"/>
+        <w:spacing w:after="0" w:before="240" w:line="416" w:lineRule="exact"/>
         <w:ind w:firstLine="1440"/>
         <w:jc w:val="thaiDistribute"/>
       </w:pPr>
@@ -311,7 +332,7 @@
     </w:p>
     <w:p>
       <w:pPr>
-        <w:spacing w:after="120" w:before="0" w:line="380" w:lineRule="exact"/>
+        <w:spacing w:after="0" w:before="240" w:line="416" w:lineRule="exact"/>
         <w:ind w:firstLine="1440"/>
         <w:jc w:val="thaiDistribute"/>
       </w:pPr>
@@ -329,7 +350,7 @@
       <w:pPr>
         <w:keepNext/>
         <w:keepLines/>
-        <w:spacing w:after="0" w:before="240" w:line="380" w:lineRule="exact"/>
+        <w:spacing w:after="0" w:before="832" w:line="416" w:lineRule="exact"/>
         <w:jc w:val="center"/>
       </w:pPr>
       <w:r>
@@ -346,7 +367,7 @@
       <w:pPr>
         <w:keepNext/>
         <w:keepLines/>
-        <w:spacing w:after="0" w:before="0" w:line="380" w:lineRule="exact"/>
+        <w:spacing w:after="0" w:before="0" w:line="416" w:lineRule="exact"/>
         <w:jc w:val="center"/>
       </w:pPr>
       <w:r>
@@ -363,7 +384,7 @@
       <w:pPr>
         <w:keepNext/>
         <w:keepLines/>
-        <w:spacing w:after="0" w:before="0" w:line="380" w:lineRule="exact"/>
+        <w:spacing w:after="0" w:before="0" w:line="416" w:lineRule="exact"/>
         <w:jc w:val="center"/>
       </w:pPr>
       <w:r>
@@ -380,7 +401,7 @@
       <w:pPr>
         <w:keepNext/>
         <w:keepLines/>
-        <w:spacing w:after="0" w:before="120" w:line="380" w:lineRule="exact"/>
+        <w:spacing w:after="0" w:before="0" w:line="416" w:lineRule="exact"/>
         <w:jc w:val="center"/>
       </w:pPr>
       <w:r>
@@ -396,7 +417,7 @@
     <w:p>
       <w:pPr>
         <w:keepLines/>
-        <w:spacing w:after="0" w:before="0" w:line="380" w:lineRule="exact"/>
+        <w:spacing w:after="0" w:before="0" w:line="416" w:lineRule="exact"/>
         <w:jc w:val="center"/>
       </w:pPr>
       <w:r>
@@ -412,7 +433,7 @@
     <w:p>
       <w:pPr>
         <w:pageBreakBefore/>
-        <w:spacing w:after="0" w:before="0" w:line="380" w:lineRule="exact"/>
+        <w:spacing w:after="0" w:before="0" w:line="416" w:lineRule="exact"/>
         <w:jc w:val="center"/>
       </w:pPr>
       <w:r>
@@ -429,7 +450,7 @@
     </w:p>
     <w:p>
       <w:pPr>
-        <w:spacing w:after="0" w:before="240" w:line="380" w:lineRule="exact"/>
+        <w:spacing w:after="0" w:before="240" w:line="416" w:lineRule="exact"/>
       </w:pPr>
       <w:r>
         <w:rPr>
@@ -443,7 +464,7 @@
     </w:p>
     <w:p>
       <w:pPr>
-        <w:spacing w:after="0" w:before="0" w:line="380" w:lineRule="exact"/>
+        <w:spacing w:after="0" w:before="0" w:line="416" w:lineRule="exact"/>
       </w:pPr>
       <w:r>
         <w:rPr>
@@ -457,7 +478,7 @@
     </w:p>
     <w:p>
       <w:pPr>
-        <w:spacing w:after="240" w:before="0" w:line="380" w:lineRule="exact"/>
+        <w:spacing w:after="240" w:before="0" w:line="416" w:lineRule="exact"/>
       </w:pPr>
       <w:r>
         <w:rPr>
@@ -508,7 +529,7 @@
           </w:tcPr>
           <w:p>
             <w:pPr>
-              <w:spacing w:after="0" w:before="0" w:line="380" w:lineRule="exact"/>
+              <w:spacing w:after="0" w:before="0" w:line="416" w:lineRule="exact"/>
               <w:jc w:val="center"/>
             </w:pPr>
             <w:r>
@@ -537,7 +558,7 @@
           </w:tcPr>
           <w:p>
             <w:pPr>
-              <w:spacing w:after="0" w:before="0" w:line="380" w:lineRule="exact"/>
+              <w:spacing w:after="0" w:before="0" w:line="416" w:lineRule="exact"/>
               <w:jc w:val="center"/>
             </w:pPr>
             <w:r>
@@ -566,7 +587,7 @@
           </w:tcPr>
           <w:p>
             <w:pPr>
-              <w:spacing w:after="0" w:before="0" w:line="380" w:lineRule="exact"/>
+              <w:spacing w:after="0" w:before="0" w:line="416" w:lineRule="exact"/>
               <w:jc w:val="center"/>
             </w:pPr>
             <w:r>
@@ -600,7 +621,7 @@
           </w:tcPr>
           <w:p>
             <w:pPr>
-              <w:spacing w:after="0" w:before="0" w:line="380" w:lineRule="exact"/>
+              <w:spacing w:after="0" w:before="0" w:line="416" w:lineRule="exact"/>
               <w:jc w:val="center"/>
             </w:pPr>
             <w:r>
@@ -626,7 +647,7 @@
           </w:p>
           <w:p>
             <w:pPr>
-              <w:spacing w:after="0" w:before="0" w:line="380" w:lineRule="exact"/>
+              <w:spacing w:after="0" w:before="0" w:line="416" w:lineRule="exact"/>
               <w:jc w:val="center"/>
             </w:pPr>
             <w:r>
@@ -653,7 +674,7 @@
           </w:tcPr>
           <w:p>
             <w:pPr>
-              <w:spacing w:after="0" w:before="0" w:line="380" w:lineRule="exact"/>
+              <w:spacing w:after="0" w:before="0" w:line="416" w:lineRule="exact"/>
               <w:jc w:val="left"/>
             </w:pPr>
             <w:r>
@@ -680,7 +701,7 @@
           </w:tcPr>
           <w:p>
             <w:pPr>
-              <w:spacing w:after="0" w:before="0" w:line="380" w:lineRule="exact"/>
+              <w:spacing w:after="0" w:before="0" w:line="416" w:lineRule="exact"/>
               <w:jc w:val="center"/>
             </w:pPr>
             <w:r>
@@ -698,7 +719,7 @@
     </w:tbl>
     <w:p>
       <w:pPr>
-        <w:spacing w:after="0" w:before="0" w:line="380" w:lineRule="exact"/>
+        <w:spacing w:after="0" w:before="0" w:line="416" w:lineRule="exact"/>
       </w:pPr>
       <w:r>
         <w:rPr>
@@ -712,7 +733,7 @@
     </w:p>
     <w:p>
       <w:pPr>
-        <w:spacing w:after="0" w:before="240" w:line="380" w:lineRule="exact"/>
+        <w:spacing w:after="0" w:before="240" w:line="416" w:lineRule="exact"/>
       </w:pPr>
       <w:r>
         <w:rPr>
@@ -729,7 +750,7 @@
     </w:p>
     <w:p>
       <w:pPr>
-        <w:spacing w:after="0" w:before="0" w:line="380" w:lineRule="exact"/>
+        <w:spacing w:after="0" w:before="0" w:line="416" w:lineRule="exact"/>
       </w:pPr>
       <w:r>
         <w:rPr>
@@ -743,7 +764,7 @@
     </w:p>
     <w:p>
       <w:pPr>
-        <w:spacing w:after="0" w:before="0" w:line="380" w:lineRule="exact"/>
+        <w:spacing w:after="0" w:before="0" w:line="416" w:lineRule="exact"/>
       </w:pPr>
       <w:r>
         <w:rPr>
@@ -757,7 +778,7 @@
     </w:p>
     <w:p>
       <w:pPr>
-        <w:spacing w:after="0" w:before="120" w:line="380" w:lineRule="exact"/>
+        <w:spacing w:after="0" w:before="120" w:line="416" w:lineRule="exact"/>
       </w:pPr>
       <w:r>
         <w:rPr>
@@ -771,7 +792,7 @@
     </w:p>
     <w:p>
       <w:pPr>
-        <w:spacing w:after="0" w:before="0" w:line="380" w:lineRule="exact"/>
+        <w:spacing w:after="0" w:before="0" w:line="416" w:lineRule="exact"/>
       </w:pPr>
       <w:r>
         <w:rPr>
@@ -797,7 +818,7 @@
     </w:p>
     <w:p>
       <w:pPr>
-        <w:spacing w:after="0" w:before="240" w:line="380" w:lineRule="exact"/>
+        <w:spacing w:after="0" w:before="240" w:line="416" w:lineRule="exact"/>
         <w:jc w:val="left"/>
       </w:pPr>
       <w:r>
@@ -812,7 +833,7 @@
     </w:p>
     <w:p>
       <w:pPr>
-        <w:spacing w:after="0" w:before="0" w:line="380" w:lineRule="exact"/>
+        <w:spacing w:after="0" w:before="0" w:line="416" w:lineRule="exact"/>
       </w:pPr>
       <w:r>
         <w:rPr>
@@ -878,7 +899,7 @@
 <w:ftr xmlns:wpc="http://schemas.microsoft.com/office/word/2010/wordprocessingCanvas" xmlns:mc="http://schemas.openxmlformats.org/markup-compatibility/2006" xmlns:o="urn:schemas-microsoft-com:office:office" xmlns:r="http://schemas.openxmlformats.org/officeDocument/2006/relationships" xmlns:m="http://schemas.openxmlformats.org/officeDocument/2006/math" xmlns:v="urn:schemas-microsoft-com:vml" xmlns:wp14="http://schemas.microsoft.com/office/word/2010/wordprocessingDrawing" xmlns:wp="http://schemas.openxmlformats.org/drawingml/2006/wordprocessingDrawing" xmlns:w10="urn:schemas-microsoft-com:office:word" xmlns:w="http://schemas.openxmlformats.org/wordprocessingml/2006/main" xmlns:w14="http://schemas.microsoft.com/office/word/2010/wordml" xmlns:w15="http://schemas.microsoft.com/office/word/2012/wordml" xmlns:wpg="http://schemas.microsoft.com/office/word/2010/wordprocessingGroup" xmlns:wpi="http://schemas.microsoft.com/office/word/2010/wordprocessingInk" xmlns:wne="http://schemas.microsoft.com/office/word/2006/wordml" xmlns:wps="http://schemas.microsoft.com/office/word/2010/wordprocessingShape">
   <w:p>
     <w:pPr>
-      <w:spacing w:after="0" w:before="0" w:line="380" w:lineRule="exact"/>
+      <w:spacing w:after="0" w:before="0" w:line="416" w:lineRule="exact"/>
     </w:pPr>
     <w:r>
       <w:rPr>
@@ -897,7 +918,7 @@
 <w:ftr xmlns:wpc="http://schemas.microsoft.com/office/word/2010/wordprocessingCanvas" xmlns:mc="http://schemas.openxmlformats.org/markup-compatibility/2006" xmlns:o="urn:schemas-microsoft-com:office:office" xmlns:r="http://schemas.openxmlformats.org/officeDocument/2006/relationships" xmlns:m="http://schemas.openxmlformats.org/officeDocument/2006/math" xmlns:v="urn:schemas-microsoft-com:vml" xmlns:wp14="http://schemas.microsoft.com/office/word/2010/wordprocessingDrawing" xmlns:wp="http://schemas.openxmlformats.org/drawingml/2006/wordprocessingDrawing" xmlns:w10="urn:schemas-microsoft-com:office:word" xmlns:w="http://schemas.openxmlformats.org/wordprocessingml/2006/main" xmlns:w14="http://schemas.microsoft.com/office/word/2010/wordml" xmlns:w15="http://schemas.microsoft.com/office/word/2012/wordml" xmlns:wpg="http://schemas.microsoft.com/office/word/2010/wordprocessingGroup" xmlns:wpi="http://schemas.microsoft.com/office/word/2010/wordprocessingInk" xmlns:wne="http://schemas.microsoft.com/office/word/2006/wordml" xmlns:wps="http://schemas.microsoft.com/office/word/2010/wordprocessingShape">
   <w:p>
     <w:pPr>
-      <w:spacing w:after="0" w:before="0" w:line="380" w:lineRule="exact"/>
+      <w:spacing w:after="0" w:before="0" w:line="416" w:lineRule="exact"/>
     </w:pPr>
     <w:r>
       <w:rPr>
@@ -911,7 +932,7 @@
   </w:p>
   <w:p>
     <w:pPr>
-      <w:spacing w:after="0" w:before="0" w:line="380" w:lineRule="exact"/>
+      <w:spacing w:after="0" w:before="0" w:line="416" w:lineRule="exact"/>
     </w:pPr>
     <w:r>
       <w:rPr>
@@ -1070,7 +1091,7 @@
     </w:rPrDefault>
     <w:pPrDefault>
       <w:pPr>
-        <w:spacing w:after="0" w:before="0" w:line="380" w:lineRule="exact"/>
+        <w:spacing w:after="0" w:before="0" w:line="416" w:lineRule="exact"/>
       </w:pPr>
     </w:pPrDefault>
   </w:docDefaults>

</xml_diff>